<commit_message>
Added class 710 documentation and added next locos to be released
</commit_message>
<xml_diff>
--- a/profiles/documentation/tsw-class-710-dtg-thejag.docx
+++ b/profiles/documentation/tsw-class-710-dtg-thejag.docx
@@ -91,7 +91,7 @@
                 <w:szCs w:val="32"/>
               </w:rPr>
               <w:drawing>
-                <wp:inline distT="0" distB="0" distL="0" distR="0" wp14:anchorId="6EE131CF" wp14:editId="22111457">
+                <wp:inline distT="0" distB="0" distL="0" distR="0" wp14:anchorId="6EE131CF" wp14:editId="65180E6C">
                   <wp:extent cx="442641" cy="360000"/>
                   <wp:effectExtent l="0" t="0" r="0" b="2540"/>
                   <wp:docPr id="661432792" name="Picture 4"/>
@@ -187,7 +187,7 @@
                 <w:noProof/>
               </w:rPr>
               <w:drawing>
-                <wp:inline distT="0" distB="0" distL="0" distR="0" wp14:anchorId="481DBD1C" wp14:editId="508D4388">
+                <wp:inline distT="0" distB="0" distL="0" distR="0" wp14:anchorId="481DBD1C" wp14:editId="66EE34A7">
                   <wp:extent cx="649240" cy="216000"/>
                   <wp:effectExtent l="0" t="0" r="0" b="0"/>
                   <wp:docPr id="951887979" name="Picture 4" descr="Start | Rivet Games"/>
@@ -376,7 +376,7 @@
                 <w:noProof/>
               </w:rPr>
               <w:drawing>
-                <wp:inline distT="0" distB="0" distL="0" distR="0" wp14:anchorId="3F19B415" wp14:editId="5DB09903">
+                <wp:inline distT="0" distB="0" distL="0" distR="0" wp14:anchorId="3F19B415" wp14:editId="5B66C854">
                   <wp:extent cx="3243408" cy="216000"/>
                   <wp:effectExtent l="0" t="0" r="0" b="0"/>
                   <wp:docPr id="423346816" name="Picture 2"/>
@@ -486,6 +486,813 @@
                 <w:szCs w:val="32"/>
               </w:rPr>
             </w:pPr>
+            <w:r>
+              <w:rPr>
+                <w:noProof/>
+                <w:color w:val="FFFFFF" w:themeColor="background1"/>
+                <w:sz w:val="32"/>
+                <w:szCs w:val="32"/>
+              </w:rPr>
+              <mc:AlternateContent>
+                <mc:Choice Requires="wps">
+                  <w:drawing>
+                    <wp:anchor distT="0" distB="0" distL="114300" distR="114300" simplePos="0" relativeHeight="251768832" behindDoc="0" locked="0" layoutInCell="1" allowOverlap="1" wp14:anchorId="2FBD4B9A" wp14:editId="00EDE554">
+                      <wp:simplePos x="0" y="0"/>
+                      <wp:positionH relativeFrom="column">
+                        <wp:posOffset>5405755</wp:posOffset>
+                      </wp:positionH>
+                      <wp:positionV relativeFrom="paragraph">
+                        <wp:posOffset>2714072</wp:posOffset>
+                      </wp:positionV>
+                      <wp:extent cx="95250" cy="95250"/>
+                      <wp:effectExtent l="0" t="0" r="19050" b="19050"/>
+                      <wp:wrapNone/>
+                      <wp:docPr id="1583634031" name="Oval 1"/>
+                      <wp:cNvGraphicFramePr/>
+                      <a:graphic xmlns:a="http://schemas.openxmlformats.org/drawingml/2006/main">
+                        <a:graphicData uri="http://schemas.microsoft.com/office/word/2010/wordprocessingShape">
+                          <wps:wsp>
+                            <wps:cNvSpPr/>
+                            <wps:spPr>
+                              <a:xfrm>
+                                <a:off x="0" y="0"/>
+                                <a:ext cx="95250" cy="95250"/>
+                              </a:xfrm>
+                              <a:prstGeom prst="ellipse">
+                                <a:avLst/>
+                              </a:prstGeom>
+                              <a:solidFill>
+                                <a:srgbClr val="00B050"/>
+                              </a:solidFill>
+                              <a:ln w="9525">
+                                <a:solidFill>
+                                  <a:schemeClr val="bg1"/>
+                                </a:solidFill>
+                              </a:ln>
+                            </wps:spPr>
+                            <wps:style>
+                              <a:lnRef idx="2">
+                                <a:schemeClr val="accent6">
+                                  <a:shade val="15000"/>
+                                </a:schemeClr>
+                              </a:lnRef>
+                              <a:fillRef idx="1">
+                                <a:schemeClr val="accent6"/>
+                              </a:fillRef>
+                              <a:effectRef idx="0">
+                                <a:schemeClr val="accent6"/>
+                              </a:effectRef>
+                              <a:fontRef idx="minor">
+                                <a:schemeClr val="lt1"/>
+                              </a:fontRef>
+                            </wps:style>
+                            <wps:bodyPr rot="0" spcFirstLastPara="0" vertOverflow="overflow" horzOverflow="overflow" vert="horz" wrap="square" lIns="91440" tIns="45720" rIns="91440" bIns="45720" numCol="1" spcCol="0" rtlCol="0" fromWordArt="0" anchor="ctr" anchorCtr="0" forceAA="0" compatLnSpc="1">
+                              <a:prstTxWarp prst="textNoShape">
+                                <a:avLst/>
+                              </a:prstTxWarp>
+                              <a:noAutofit/>
+                            </wps:bodyPr>
+                          </wps:wsp>
+                        </a:graphicData>
+                      </a:graphic>
+                      <wp14:sizeRelH relativeFrom="margin">
+                        <wp14:pctWidth>0</wp14:pctWidth>
+                      </wp14:sizeRelH>
+                      <wp14:sizeRelV relativeFrom="margin">
+                        <wp14:pctHeight>0</wp14:pctHeight>
+                      </wp14:sizeRelV>
+                    </wp:anchor>
+                  </w:drawing>
+                </mc:Choice>
+                <mc:Fallback>
+                  <w:pict>
+                    <v:oval w14:anchorId="1B2625AE" id="Oval 1" o:spid="_x0000_s1026" style="position:absolute;margin-left:425.65pt;margin-top:213.7pt;width:7.5pt;height:7.5pt;z-index:251768832;visibility:visible;mso-wrap-style:square;mso-width-percent:0;mso-height-percent:0;mso-wrap-distance-left:9pt;mso-wrap-distance-top:0;mso-wrap-distance-right:9pt;mso-wrap-distance-bottom:0;mso-position-horizontal:absolute;mso-position-horizontal-relative:text;mso-position-vertical:absolute;mso-position-vertical-relative:text;mso-width-percent:0;mso-height-percent:0;mso-width-relative:margin;mso-height-relative:margin;v-text-anchor:middle" o:gfxdata="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" fillcolor="#00b050" strokecolor="white [3212]">
+                      <v:stroke joinstyle="miter"/>
+                    </v:oval>
+                  </w:pict>
+                </mc:Fallback>
+              </mc:AlternateContent>
+            </w:r>
+            <w:r>
+              <w:rPr>
+                <w:noProof/>
+                <w:color w:val="FFFFFF" w:themeColor="background1"/>
+                <w:sz w:val="32"/>
+                <w:szCs w:val="32"/>
+              </w:rPr>
+              <mc:AlternateContent>
+                <mc:Choice Requires="wps">
+                  <w:drawing>
+                    <wp:anchor distT="0" distB="0" distL="114300" distR="114300" simplePos="0" relativeHeight="251767808" behindDoc="0" locked="0" layoutInCell="1" allowOverlap="1" wp14:anchorId="4C8F10E6" wp14:editId="05CF08D1">
+                      <wp:simplePos x="0" y="0"/>
+                      <wp:positionH relativeFrom="column">
+                        <wp:posOffset>5622290</wp:posOffset>
+                      </wp:positionH>
+                      <wp:positionV relativeFrom="paragraph">
+                        <wp:posOffset>1120775</wp:posOffset>
+                      </wp:positionV>
+                      <wp:extent cx="730250" cy="1778000"/>
+                      <wp:effectExtent l="0" t="0" r="0" b="0"/>
+                      <wp:wrapNone/>
+                      <wp:docPr id="1217886663" name="Rectangle 1"/>
+                      <wp:cNvGraphicFramePr/>
+                      <a:graphic xmlns:a="http://schemas.openxmlformats.org/drawingml/2006/main">
+                        <a:graphicData uri="http://schemas.microsoft.com/office/word/2010/wordprocessingShape">
+                          <wps:wsp>
+                            <wps:cNvSpPr/>
+                            <wps:spPr>
+                              <a:xfrm flipH="1">
+                                <a:off x="0" y="0"/>
+                                <a:ext cx="730250" cy="1778000"/>
+                              </a:xfrm>
+                              <a:prstGeom prst="rect">
+                                <a:avLst/>
+                              </a:prstGeom>
+                              <a:noFill/>
+                              <a:ln w="12700">
+                                <a:noFill/>
+                              </a:ln>
+                            </wps:spPr>
+                            <wps:style>
+                              <a:lnRef idx="2">
+                                <a:schemeClr val="accent1">
+                                  <a:shade val="15000"/>
+                                </a:schemeClr>
+                              </a:lnRef>
+                              <a:fillRef idx="1">
+                                <a:schemeClr val="accent1"/>
+                              </a:fillRef>
+                              <a:effectRef idx="0">
+                                <a:schemeClr val="accent1"/>
+                              </a:effectRef>
+                              <a:fontRef idx="minor">
+                                <a:schemeClr val="lt1"/>
+                              </a:fontRef>
+                            </wps:style>
+                            <wps:txbx>
+                              <w:txbxContent>
+                                <w:p>
+                                  <w:pPr>
+                                    <w:spacing w:after="0" w:line="300" w:lineRule="exact"/>
+                                    <w:rPr>
+                                      <w:b/>
+                                      <w:bCs/>
+                                      <w:color w:val="FF0000"/>
+                                      <w:sz w:val="20"/>
+                                      <w:szCs w:val="20"/>
+                                      <w14:shadow w14:blurRad="50800" w14:dist="38100" w14:dir="2700000" w14:sx="100000" w14:sy="100000" w14:kx="0" w14:ky="0" w14:algn="tl">
+                                        <w14:srgbClr w14:val="000000">
+                                          <w14:alpha w14:val="60000"/>
+                                        </w14:srgbClr>
+                                      </w14:shadow>
+                                    </w:rPr>
+                                  </w:pPr>
+                                  <w:r>
+                                    <w:rPr>
+                                      <w:b/>
+                                      <w:bCs/>
+                                      <w:color w:val="FF0000"/>
+                                      <w:sz w:val="20"/>
+                                      <w:szCs w:val="20"/>
+                                      <w14:shadow w14:blurRad="50800" w14:dist="38100" w14:dir="2700000" w14:sx="100000" w14:sy="100000" w14:kx="0" w14:ky="0" w14:algn="tl">
+                                        <w14:srgbClr w14:val="000000">
+                                          <w14:alpha w14:val="60000"/>
+                                        </w14:srgbClr>
+                                      </w14:shadow>
+                                    </w:rPr>
+                                    <w:t>Full</w:t>
+                                  </w:r>
+                                </w:p>
+                                <w:p>
+                                  <w:pPr>
+                                    <w:spacing w:after="0" w:line="300" w:lineRule="exact"/>
+                                    <w:rPr>
+                                      <w:b/>
+                                      <w:bCs/>
+                                      <w:color w:val="FF0000"/>
+                                      <w:sz w:val="20"/>
+                                      <w:szCs w:val="20"/>
+                                      <w14:shadow w14:blurRad="50800" w14:dist="38100" w14:dir="2700000" w14:sx="100000" w14:sy="100000" w14:kx="0" w14:ky="0" w14:algn="tl">
+                                        <w14:srgbClr w14:val="000000">
+                                          <w14:alpha w14:val="60000"/>
+                                        </w14:srgbClr>
+                                      </w14:shadow>
+                                    </w:rPr>
+                                  </w:pPr>
+                                </w:p>
+                                <w:p>
+                                  <w:pPr>
+                                    <w:spacing w:after="0" w:line="300" w:lineRule="exact"/>
+                                    <w:rPr>
+                                      <w:b/>
+                                      <w:bCs/>
+                                      <w:color w:val="FF0000"/>
+                                      <w:sz w:val="20"/>
+                                      <w:szCs w:val="20"/>
+                                      <w14:shadow w14:blurRad="50800" w14:dist="38100" w14:dir="2700000" w14:sx="100000" w14:sy="100000" w14:kx="0" w14:ky="0" w14:algn="tl">
+                                        <w14:srgbClr w14:val="000000">
+                                          <w14:alpha w14:val="60000"/>
+                                        </w14:srgbClr>
+                                      </w14:shadow>
+                                    </w:rPr>
+                                  </w:pPr>
+                                </w:p>
+                                <w:p>
+                                  <w:pPr>
+                                    <w:spacing w:after="0" w:line="300" w:lineRule="exact"/>
+                                    <w:rPr>
+                                      <w:b/>
+                                      <w:bCs/>
+                                      <w:color w:val="FF0000"/>
+                                      <w:sz w:val="20"/>
+                                      <w:szCs w:val="20"/>
+                                      <w14:shadow w14:blurRad="50800" w14:dist="38100" w14:dir="2700000" w14:sx="100000" w14:sy="100000" w14:kx="0" w14:ky="0" w14:algn="tl">
+                                        <w14:srgbClr w14:val="000000">
+                                          <w14:alpha w14:val="60000"/>
+                                        </w14:srgbClr>
+                                      </w14:shadow>
+                                    </w:rPr>
+                                  </w:pPr>
+                                </w:p>
+                                <w:p>
+                                  <w:pPr>
+                                    <w:spacing w:after="0" w:line="300" w:lineRule="exact"/>
+                                    <w:rPr>
+                                      <w:b/>
+                                      <w:bCs/>
+                                      <w:color w:val="FF0000"/>
+                                      <w:sz w:val="20"/>
+                                      <w:szCs w:val="20"/>
+                                      <w14:shadow w14:blurRad="50800" w14:dist="38100" w14:dir="2700000" w14:sx="100000" w14:sy="100000" w14:kx="0" w14:ky="0" w14:algn="tl">
+                                        <w14:srgbClr w14:val="000000">
+                                          <w14:alpha w14:val="60000"/>
+                                        </w14:srgbClr>
+                                      </w14:shadow>
+                                    </w:rPr>
+                                  </w:pPr>
+                                  <w:r>
+                                    <w:rPr>
+                                      <w:b/>
+                                      <w:bCs/>
+                                      <w:color w:val="FF0000"/>
+                                      <w:sz w:val="20"/>
+                                      <w:szCs w:val="20"/>
+                                      <w14:shadow w14:blurRad="50800" w14:dist="38100" w14:dir="2700000" w14:sx="100000" w14:sy="100000" w14:kx="0" w14:ky="0" w14:algn="tl">
+                                        <w14:srgbClr w14:val="000000">
+                                          <w14:alpha w14:val="60000"/>
+                                        </w14:srgbClr>
+                                      </w14:shadow>
+                                    </w:rPr>
+                                    <w:t>Half</w:t>
+                                  </w:r>
+                                </w:p>
+                                <w:p>
+                                  <w:pPr>
+                                    <w:spacing w:after="0" w:line="300" w:lineRule="exact"/>
+                                    <w:rPr>
+                                      <w:b/>
+                                      <w:bCs/>
+                                      <w:color w:val="FF0000"/>
+                                      <w:sz w:val="20"/>
+                                      <w:szCs w:val="20"/>
+                                      <w14:shadow w14:blurRad="50800" w14:dist="38100" w14:dir="2700000" w14:sx="100000" w14:sy="100000" w14:kx="0" w14:ky="0" w14:algn="tl">
+                                        <w14:srgbClr w14:val="000000">
+                                          <w14:alpha w14:val="60000"/>
+                                        </w14:srgbClr>
+                                      </w14:shadow>
+                                    </w:rPr>
+                                  </w:pPr>
+                                </w:p>
+                                <w:p>
+                                  <w:pPr>
+                                    <w:spacing w:after="0" w:line="300" w:lineRule="exact"/>
+                                    <w:rPr>
+                                      <w:b/>
+                                      <w:bCs/>
+                                      <w:color w:val="FF0000"/>
+                                      <w:sz w:val="20"/>
+                                      <w:szCs w:val="20"/>
+                                      <w14:shadow w14:blurRad="50800" w14:dist="38100" w14:dir="2700000" w14:sx="100000" w14:sy="100000" w14:kx="0" w14:ky="0" w14:algn="tl">
+                                        <w14:srgbClr w14:val="000000">
+                                          <w14:alpha w14:val="60000"/>
+                                        </w14:srgbClr>
+                                      </w14:shadow>
+                                    </w:rPr>
+                                  </w:pPr>
+                                </w:p>
+                                <w:p>
+                                  <w:pPr>
+                                    <w:spacing w:after="0" w:line="300" w:lineRule="exact"/>
+                                    <w:rPr>
+                                      <w:b/>
+                                      <w:bCs/>
+                                      <w:color w:val="FF0000"/>
+                                      <w:sz w:val="20"/>
+                                      <w:szCs w:val="20"/>
+                                      <w14:shadow w14:blurRad="50800" w14:dist="38100" w14:dir="2700000" w14:sx="100000" w14:sy="100000" w14:kx="0" w14:ky="0" w14:algn="tl">
+                                        <w14:srgbClr w14:val="000000">
+                                          <w14:alpha w14:val="60000"/>
+                                        </w14:srgbClr>
+                                      </w14:shadow>
+                                    </w:rPr>
+                                  </w:pPr>
+                                </w:p>
+                                <w:p>
+                                  <w:pPr>
+                                    <w:spacing w:after="0" w:line="300" w:lineRule="exact"/>
+                                    <w:rPr>
+                                      <w:b/>
+                                      <w:bCs/>
+                                      <w:color w:val="FF0000"/>
+                                      <w:sz w:val="20"/>
+                                      <w:szCs w:val="20"/>
+                                      <w14:shadow w14:blurRad="50800" w14:dist="38100" w14:dir="2700000" w14:sx="100000" w14:sy="100000" w14:kx="0" w14:ky="0" w14:algn="tl">
+                                        <w14:srgbClr w14:val="000000">
+                                          <w14:alpha w14:val="60000"/>
+                                        </w14:srgbClr>
+                                      </w14:shadow>
+                                    </w:rPr>
+                                  </w:pPr>
+                                  <w:r>
+                                    <w:rPr>
+                                      <w:b/>
+                                      <w:bCs/>
+                                      <w:color w:val="FF0000"/>
+                                      <w:sz w:val="20"/>
+                                      <w:szCs w:val="20"/>
+                                      <w14:shadow w14:blurRad="50800" w14:dist="38100" w14:dir="2700000" w14:sx="100000" w14:sy="100000" w14:kx="0" w14:ky="0" w14:algn="tl">
+                                        <w14:srgbClr w14:val="000000">
+                                          <w14:alpha w14:val="60000"/>
+                                        </w14:srgbClr>
+                                      </w14:shadow>
+                                    </w:rPr>
+                                    <w:t>Off</w:t>
+                                  </w:r>
+                                </w:p>
+                                <w:p>
+                                  <w:pPr>
+                                    <w:spacing w:after="0" w:line="300" w:lineRule="exact"/>
+                                  </w:pPr>
+                                  <w:r>
+                                    <w:rPr>
+                                      <w:b/>
+                                      <w:bCs/>
+                                      <w:color w:val="FF0000"/>
+                                      <w:sz w:val="20"/>
+                                      <w:szCs w:val="20"/>
+                                      <w14:shadow w14:blurRad="50800" w14:dist="38100" w14:dir="2700000" w14:sx="100000" w14:sy="100000" w14:kx="0" w14:ky="0" w14:algn="tl">
+                                        <w14:srgbClr w14:val="000000">
+                                          <w14:alpha w14:val="60000"/>
+                                        </w14:srgbClr>
+                                      </w14:shadow>
+                                    </w:rPr>
+                                    <w:t xml:space="preserve">  </w:t>
+                                  </w:r>
+                                </w:p>
+                              </w:txbxContent>
+                            </wps:txbx>
+                            <wps:bodyPr rot="0" spcFirstLastPara="0" vertOverflow="overflow" horzOverflow="overflow" vert="horz" wrap="square" lIns="0" tIns="0" rIns="0" bIns="0" numCol="1" spcCol="0" rtlCol="0" fromWordArt="0" anchor="t" anchorCtr="0" forceAA="0" compatLnSpc="1">
+                              <a:prstTxWarp prst="textNoShape">
+                                <a:avLst/>
+                              </a:prstTxWarp>
+                              <a:noAutofit/>
+                            </wps:bodyPr>
+                          </wps:wsp>
+                        </a:graphicData>
+                      </a:graphic>
+                      <wp14:sizeRelH relativeFrom="margin">
+                        <wp14:pctWidth>0</wp14:pctWidth>
+                      </wp14:sizeRelH>
+                      <wp14:sizeRelV relativeFrom="margin">
+                        <wp14:pctHeight>0</wp14:pctHeight>
+                      </wp14:sizeRelV>
+                    </wp:anchor>
+                  </w:drawing>
+                </mc:Choice>
+                <mc:Fallback>
+                  <w:pict>
+                    <v:rect w14:anchorId="4C8F10E6" id="Rectangle 1" o:spid="_x0000_s1026" style="position:absolute;left:0;text-align:left;margin-left:442.7pt;margin-top:88.25pt;width:57.5pt;height:140pt;flip:x;z-index:251767808;visibility:visible;mso-wrap-style:square;mso-width-percent:0;mso-height-percent:0;mso-wrap-distance-left:9pt;mso-wrap-distance-top:0;mso-wrap-distance-right:9pt;mso-wrap-distance-bottom:0;mso-position-horizontal:absolute;mso-position-horizontal-relative:text;mso-position-vertical:absolute;mso-position-vertical-relative:text;mso-width-percent:0;mso-height-percent:0;mso-width-relative:margin;mso-height-relative:margin;v-text-anchor:top" o:gfxdata="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" filled="f" stroked="f" strokeweight="1pt">
+                      <v:textbox inset="0,0,0,0">
+                        <w:txbxContent>
+                          <w:p>
+                            <w:pPr>
+                              <w:spacing w:after="0" w:line="300" w:lineRule="exact"/>
+                              <w:rPr>
+                                <w:b/>
+                                <w:bCs/>
+                                <w:color w:val="FF0000"/>
+                                <w:sz w:val="20"/>
+                                <w:szCs w:val="20"/>
+                                <w14:shadow w14:blurRad="50800" w14:dist="38100" w14:dir="2700000" w14:sx="100000" w14:sy="100000" w14:kx="0" w14:ky="0" w14:algn="tl">
+                                  <w14:srgbClr w14:val="000000">
+                                    <w14:alpha w14:val="60000"/>
+                                  </w14:srgbClr>
+                                </w14:shadow>
+                              </w:rPr>
+                            </w:pPr>
+                            <w:r>
+                              <w:rPr>
+                                <w:b/>
+                                <w:bCs/>
+                                <w:color w:val="FF0000"/>
+                                <w:sz w:val="20"/>
+                                <w:szCs w:val="20"/>
+                                <w14:shadow w14:blurRad="50800" w14:dist="38100" w14:dir="2700000" w14:sx="100000" w14:sy="100000" w14:kx="0" w14:ky="0" w14:algn="tl">
+                                  <w14:srgbClr w14:val="000000">
+                                    <w14:alpha w14:val="60000"/>
+                                  </w14:srgbClr>
+                                </w14:shadow>
+                              </w:rPr>
+                              <w:t>Full</w:t>
+                            </w:r>
+                          </w:p>
+                          <w:p>
+                            <w:pPr>
+                              <w:spacing w:after="0" w:line="300" w:lineRule="exact"/>
+                              <w:rPr>
+                                <w:b/>
+                                <w:bCs/>
+                                <w:color w:val="FF0000"/>
+                                <w:sz w:val="20"/>
+                                <w:szCs w:val="20"/>
+                                <w14:shadow w14:blurRad="50800" w14:dist="38100" w14:dir="2700000" w14:sx="100000" w14:sy="100000" w14:kx="0" w14:ky="0" w14:algn="tl">
+                                  <w14:srgbClr w14:val="000000">
+                                    <w14:alpha w14:val="60000"/>
+                                  </w14:srgbClr>
+                                </w14:shadow>
+                              </w:rPr>
+                            </w:pPr>
+                          </w:p>
+                          <w:p>
+                            <w:pPr>
+                              <w:spacing w:after="0" w:line="300" w:lineRule="exact"/>
+                              <w:rPr>
+                                <w:b/>
+                                <w:bCs/>
+                                <w:color w:val="FF0000"/>
+                                <w:sz w:val="20"/>
+                                <w:szCs w:val="20"/>
+                                <w14:shadow w14:blurRad="50800" w14:dist="38100" w14:dir="2700000" w14:sx="100000" w14:sy="100000" w14:kx="0" w14:ky="0" w14:algn="tl">
+                                  <w14:srgbClr w14:val="000000">
+                                    <w14:alpha w14:val="60000"/>
+                                  </w14:srgbClr>
+                                </w14:shadow>
+                              </w:rPr>
+                            </w:pPr>
+                          </w:p>
+                          <w:p>
+                            <w:pPr>
+                              <w:spacing w:after="0" w:line="300" w:lineRule="exact"/>
+                              <w:rPr>
+                                <w:b/>
+                                <w:bCs/>
+                                <w:color w:val="FF0000"/>
+                                <w:sz w:val="20"/>
+                                <w:szCs w:val="20"/>
+                                <w14:shadow w14:blurRad="50800" w14:dist="38100" w14:dir="2700000" w14:sx="100000" w14:sy="100000" w14:kx="0" w14:ky="0" w14:algn="tl">
+                                  <w14:srgbClr w14:val="000000">
+                                    <w14:alpha w14:val="60000"/>
+                                  </w14:srgbClr>
+                                </w14:shadow>
+                              </w:rPr>
+                            </w:pPr>
+                          </w:p>
+                          <w:p>
+                            <w:pPr>
+                              <w:spacing w:after="0" w:line="300" w:lineRule="exact"/>
+                              <w:rPr>
+                                <w:b/>
+                                <w:bCs/>
+                                <w:color w:val="FF0000"/>
+                                <w:sz w:val="20"/>
+                                <w:szCs w:val="20"/>
+                                <w14:shadow w14:blurRad="50800" w14:dist="38100" w14:dir="2700000" w14:sx="100000" w14:sy="100000" w14:kx="0" w14:ky="0" w14:algn="tl">
+                                  <w14:srgbClr w14:val="000000">
+                                    <w14:alpha w14:val="60000"/>
+                                  </w14:srgbClr>
+                                </w14:shadow>
+                              </w:rPr>
+                            </w:pPr>
+                            <w:r>
+                              <w:rPr>
+                                <w:b/>
+                                <w:bCs/>
+                                <w:color w:val="FF0000"/>
+                                <w:sz w:val="20"/>
+                                <w:szCs w:val="20"/>
+                                <w14:shadow w14:blurRad="50800" w14:dist="38100" w14:dir="2700000" w14:sx="100000" w14:sy="100000" w14:kx="0" w14:ky="0" w14:algn="tl">
+                                  <w14:srgbClr w14:val="000000">
+                                    <w14:alpha w14:val="60000"/>
+                                  </w14:srgbClr>
+                                </w14:shadow>
+                              </w:rPr>
+                              <w:t>Half</w:t>
+                            </w:r>
+                          </w:p>
+                          <w:p>
+                            <w:pPr>
+                              <w:spacing w:after="0" w:line="300" w:lineRule="exact"/>
+                              <w:rPr>
+                                <w:b/>
+                                <w:bCs/>
+                                <w:color w:val="FF0000"/>
+                                <w:sz w:val="20"/>
+                                <w:szCs w:val="20"/>
+                                <w14:shadow w14:blurRad="50800" w14:dist="38100" w14:dir="2700000" w14:sx="100000" w14:sy="100000" w14:kx="0" w14:ky="0" w14:algn="tl">
+                                  <w14:srgbClr w14:val="000000">
+                                    <w14:alpha w14:val="60000"/>
+                                  </w14:srgbClr>
+                                </w14:shadow>
+                              </w:rPr>
+                            </w:pPr>
+                          </w:p>
+                          <w:p>
+                            <w:pPr>
+                              <w:spacing w:after="0" w:line="300" w:lineRule="exact"/>
+                              <w:rPr>
+                                <w:b/>
+                                <w:bCs/>
+                                <w:color w:val="FF0000"/>
+                                <w:sz w:val="20"/>
+                                <w:szCs w:val="20"/>
+                                <w14:shadow w14:blurRad="50800" w14:dist="38100" w14:dir="2700000" w14:sx="100000" w14:sy="100000" w14:kx="0" w14:ky="0" w14:algn="tl">
+                                  <w14:srgbClr w14:val="000000">
+                                    <w14:alpha w14:val="60000"/>
+                                  </w14:srgbClr>
+                                </w14:shadow>
+                              </w:rPr>
+                            </w:pPr>
+                          </w:p>
+                          <w:p>
+                            <w:pPr>
+                              <w:spacing w:after="0" w:line="300" w:lineRule="exact"/>
+                              <w:rPr>
+                                <w:b/>
+                                <w:bCs/>
+                                <w:color w:val="FF0000"/>
+                                <w:sz w:val="20"/>
+                                <w:szCs w:val="20"/>
+                                <w14:shadow w14:blurRad="50800" w14:dist="38100" w14:dir="2700000" w14:sx="100000" w14:sy="100000" w14:kx="0" w14:ky="0" w14:algn="tl">
+                                  <w14:srgbClr w14:val="000000">
+                                    <w14:alpha w14:val="60000"/>
+                                  </w14:srgbClr>
+                                </w14:shadow>
+                              </w:rPr>
+                            </w:pPr>
+                          </w:p>
+                          <w:p>
+                            <w:pPr>
+                              <w:spacing w:after="0" w:line="300" w:lineRule="exact"/>
+                              <w:rPr>
+                                <w:b/>
+                                <w:bCs/>
+                                <w:color w:val="FF0000"/>
+                                <w:sz w:val="20"/>
+                                <w:szCs w:val="20"/>
+                                <w14:shadow w14:blurRad="50800" w14:dist="38100" w14:dir="2700000" w14:sx="100000" w14:sy="100000" w14:kx="0" w14:ky="0" w14:algn="tl">
+                                  <w14:srgbClr w14:val="000000">
+                                    <w14:alpha w14:val="60000"/>
+                                  </w14:srgbClr>
+                                </w14:shadow>
+                              </w:rPr>
+                            </w:pPr>
+                            <w:r>
+                              <w:rPr>
+                                <w:b/>
+                                <w:bCs/>
+                                <w:color w:val="FF0000"/>
+                                <w:sz w:val="20"/>
+                                <w:szCs w:val="20"/>
+                                <w14:shadow w14:blurRad="50800" w14:dist="38100" w14:dir="2700000" w14:sx="100000" w14:sy="100000" w14:kx="0" w14:ky="0" w14:algn="tl">
+                                  <w14:srgbClr w14:val="000000">
+                                    <w14:alpha w14:val="60000"/>
+                                  </w14:srgbClr>
+                                </w14:shadow>
+                              </w:rPr>
+                              <w:t>Off</w:t>
+                            </w:r>
+                          </w:p>
+                          <w:p>
+                            <w:pPr>
+                              <w:spacing w:after="0" w:line="300" w:lineRule="exact"/>
+                            </w:pPr>
+                            <w:r>
+                              <w:rPr>
+                                <w:b/>
+                                <w:bCs/>
+                                <w:color w:val="FF0000"/>
+                                <w:sz w:val="20"/>
+                                <w:szCs w:val="20"/>
+                                <w14:shadow w14:blurRad="50800" w14:dist="38100" w14:dir="2700000" w14:sx="100000" w14:sy="100000" w14:kx="0" w14:ky="0" w14:algn="tl">
+                                  <w14:srgbClr w14:val="000000">
+                                    <w14:alpha w14:val="60000"/>
+                                  </w14:srgbClr>
+                                </w14:shadow>
+                              </w:rPr>
+                              <w:t xml:space="preserve">  </w:t>
+                            </w:r>
+                          </w:p>
+                        </w:txbxContent>
+                      </v:textbox>
+                    </v:rect>
+                  </w:pict>
+                </mc:Fallback>
+              </mc:AlternateContent>
+            </w:r>
+            <w:r>
+              <w:rPr>
+                <w:rFonts w:ascii="Magneto" w:hAnsi="Magneto"/>
+                <w:noProof/>
+                <w:color w:val="FFFFFF" w:themeColor="background1"/>
+                <w:sz w:val="16"/>
+                <w:szCs w:val="16"/>
+              </w:rPr>
+              <mc:AlternateContent>
+                <mc:Choice Requires="wpg">
+                  <w:drawing>
+                    <wp:anchor distT="0" distB="0" distL="114300" distR="114300" simplePos="0" relativeHeight="251766784" behindDoc="0" locked="0" layoutInCell="1" allowOverlap="1" wp14:anchorId="7CC071E3" wp14:editId="2F514A44">
+                      <wp:simplePos x="0" y="0"/>
+                      <wp:positionH relativeFrom="column">
+                        <wp:posOffset>5412740</wp:posOffset>
+                      </wp:positionH>
+                      <wp:positionV relativeFrom="paragraph">
+                        <wp:posOffset>1254760</wp:posOffset>
+                      </wp:positionV>
+                      <wp:extent cx="72390" cy="1516380"/>
+                      <wp:effectExtent l="0" t="0" r="22860" b="26670"/>
+                      <wp:wrapNone/>
+                      <wp:docPr id="808224933" name="Group 5"/>
+                      <wp:cNvGraphicFramePr/>
+                      <a:graphic xmlns:a="http://schemas.openxmlformats.org/drawingml/2006/main">
+                        <a:graphicData uri="http://schemas.microsoft.com/office/word/2010/wordprocessingGroup">
+                          <wpg:wgp>
+                            <wpg:cNvGrpSpPr/>
+                            <wpg:grpSpPr>
+                              <a:xfrm>
+                                <a:off x="0" y="0"/>
+                                <a:ext cx="72390" cy="1516380"/>
+                                <a:chOff x="0" y="0"/>
+                                <a:chExt cx="72390" cy="1516380"/>
+                              </a:xfrm>
+                            </wpg:grpSpPr>
+                            <wps:wsp>
+                              <wps:cNvPr id="1567557166" name="Straight Connector 2"/>
+                              <wps:cNvCnPr/>
+                              <wps:spPr>
+                                <a:xfrm flipH="1">
+                                  <a:off x="1905" y="1905"/>
+                                  <a:ext cx="70485" cy="0"/>
+                                </a:xfrm>
+                                <a:prstGeom prst="line">
+                                  <a:avLst/>
+                                </a:prstGeom>
+                                <a:ln>
+                                  <a:solidFill>
+                                    <a:srgbClr val="FF0000"/>
+                                  </a:solidFill>
+                                </a:ln>
+                              </wps:spPr>
+                              <wps:style>
+                                <a:lnRef idx="2">
+                                  <a:schemeClr val="accent1"/>
+                                </a:lnRef>
+                                <a:fillRef idx="0">
+                                  <a:schemeClr val="accent1"/>
+                                </a:fillRef>
+                                <a:effectRef idx="1">
+                                  <a:schemeClr val="accent1"/>
+                                </a:effectRef>
+                                <a:fontRef idx="minor">
+                                  <a:schemeClr val="tx1"/>
+                                </a:fontRef>
+                              </wps:style>
+                              <wps:bodyPr/>
+                            </wps:wsp>
+                            <wps:wsp>
+                              <wps:cNvPr id="1078635612" name="Straight Connector 2"/>
+                              <wps:cNvCnPr/>
+                              <wps:spPr>
+                                <a:xfrm flipH="1">
+                                  <a:off x="0" y="1516380"/>
+                                  <a:ext cx="70485" cy="0"/>
+                                </a:xfrm>
+                                <a:prstGeom prst="line">
+                                  <a:avLst/>
+                                </a:prstGeom>
+                                <a:ln>
+                                  <a:solidFill>
+                                    <a:srgbClr val="FF0000"/>
+                                  </a:solidFill>
+                                </a:ln>
+                              </wps:spPr>
+                              <wps:style>
+                                <a:lnRef idx="2">
+                                  <a:schemeClr val="accent1"/>
+                                </a:lnRef>
+                                <a:fillRef idx="0">
+                                  <a:schemeClr val="accent1"/>
+                                </a:fillRef>
+                                <a:effectRef idx="1">
+                                  <a:schemeClr val="accent1"/>
+                                </a:effectRef>
+                                <a:fontRef idx="minor">
+                                  <a:schemeClr val="tx1"/>
+                                </a:fontRef>
+                              </wps:style>
+                              <wps:bodyPr/>
+                            </wps:wsp>
+                            <wps:wsp>
+                              <wps:cNvPr id="1083387610" name="Straight Connector 3"/>
+                              <wps:cNvCnPr/>
+                              <wps:spPr>
+                                <a:xfrm>
+                                  <a:off x="36195" y="0"/>
+                                  <a:ext cx="0" cy="1514475"/>
+                                </a:xfrm>
+                                <a:prstGeom prst="line">
+                                  <a:avLst/>
+                                </a:prstGeom>
+                                <a:ln>
+                                  <a:solidFill>
+                                    <a:srgbClr val="FF0000"/>
+                                  </a:solidFill>
+                                </a:ln>
+                              </wps:spPr>
+                              <wps:style>
+                                <a:lnRef idx="2">
+                                  <a:schemeClr val="accent1"/>
+                                </a:lnRef>
+                                <a:fillRef idx="0">
+                                  <a:schemeClr val="accent1"/>
+                                </a:fillRef>
+                                <a:effectRef idx="1">
+                                  <a:schemeClr val="accent1"/>
+                                </a:effectRef>
+                                <a:fontRef idx="minor">
+                                  <a:schemeClr val="tx1"/>
+                                </a:fontRef>
+                              </wps:style>
+                              <wps:bodyPr/>
+                            </wps:wsp>
+                            <wps:wsp>
+                              <wps:cNvPr id="2144842684" name="Straight Connector 2"/>
+                              <wps:cNvCnPr/>
+                              <wps:spPr>
+                                <a:xfrm flipH="1">
+                                  <a:off x="0" y="756951"/>
+                                  <a:ext cx="70485" cy="0"/>
+                                </a:xfrm>
+                                <a:prstGeom prst="line">
+                                  <a:avLst/>
+                                </a:prstGeom>
+                                <a:ln>
+                                  <a:solidFill>
+                                    <a:srgbClr val="FF0000"/>
+                                  </a:solidFill>
+                                </a:ln>
+                              </wps:spPr>
+                              <wps:style>
+                                <a:lnRef idx="2">
+                                  <a:schemeClr val="accent1"/>
+                                </a:lnRef>
+                                <a:fillRef idx="0">
+                                  <a:schemeClr val="accent1"/>
+                                </a:fillRef>
+                                <a:effectRef idx="1">
+                                  <a:schemeClr val="accent1"/>
+                                </a:effectRef>
+                                <a:fontRef idx="minor">
+                                  <a:schemeClr val="tx1"/>
+                                </a:fontRef>
+                              </wps:style>
+                              <wps:bodyPr/>
+                            </wps:wsp>
+                          </wpg:wgp>
+                        </a:graphicData>
+                      </a:graphic>
+                    </wp:anchor>
+                  </w:drawing>
+                </mc:Choice>
+                <mc:Fallback>
+                  <w:pict>
+                    <v:group w14:anchorId="1B51D50B" id="Group 5" o:spid="_x0000_s1026" style="position:absolute;margin-left:426.2pt;margin-top:98.8pt;width:5.7pt;height:119.4pt;z-index:251766784" coordsize="723,15163" o:gfxdata="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">
+                      <v:line id="Straight Connector 2" o:spid="_x0000_s1027" style="position:absolute;flip:x;visibility:visible;mso-wrap-style:square" from="19,19" to="723,19" o:connectortype="straight" o:gfxdata="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" strokecolor="red" strokeweight="1.5pt">
+                        <v:stroke joinstyle="miter"/>
+                      </v:line>
+                      <v:line id="Straight Connector 2" o:spid="_x0000_s1028" style="position:absolute;flip:x;visibility:visible;mso-wrap-style:square" from="0,15163" to="704,15163" o:connectortype="straight" o:gfxdata="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" strokecolor="red" strokeweight="1.5pt">
+                        <v:stroke joinstyle="miter"/>
+                      </v:line>
+                      <v:line id="Straight Connector 3" o:spid="_x0000_s1029" style="position:absolute;visibility:visible;mso-wrap-style:square" from="361,0" to="361,15144" o:connectortype="straight" o:gfxdata="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" strokecolor="red" strokeweight="1.5pt">
+                        <v:stroke joinstyle="miter"/>
+                      </v:line>
+                      <v:line id="Straight Connector 2" o:spid="_x0000_s1030" style="position:absolute;flip:x;visibility:visible;mso-wrap-style:square" from="0,7569" to="704,7569" o:connectortype="straight" o:gfxdata="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" strokecolor="red" strokeweight="1.5pt">
+                        <v:stroke joinstyle="miter"/>
+                      </v:line>
+                    </v:group>
+                  </w:pict>
+                </mc:Fallback>
+              </mc:AlternateContent>
+            </w:r>
             <w:r>
               <w:rPr>
                 <w:rFonts w:ascii="Magneto" w:hAnsi="Magneto"/>
@@ -1193,7 +2000,7 @@
                 </mc:Choice>
                 <mc:Fallback>
                   <w:pict>
-                    <v:rect w14:anchorId="64590315" id="Rectangle 1" o:spid="_x0000_s1026" style="position:absolute;left:0;text-align:left;margin-left:-2pt;margin-top:96.9pt;width:77.15pt;height:175.3pt;z-index:251757568;visibility:visible;mso-wrap-style:square;mso-width-percent:0;mso-height-percent:0;mso-wrap-distance-left:9pt;mso-wrap-distance-top:0;mso-wrap-distance-right:9pt;mso-wrap-distance-bottom:0;mso-position-horizontal:absolute;mso-position-horizontal-relative:text;mso-position-vertical:absolute;mso-position-vertical-relative:text;mso-width-percent:0;mso-height-percent:0;mso-width-relative:margin;mso-height-relative:margin;v-text-anchor:top" o:gfxdata="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" filled="f" stroked="f" strokeweight="1pt">
+                    <v:rect w14:anchorId="64590315" id="_x0000_s1027" style="position:absolute;left:0;text-align:left;margin-left:-2pt;margin-top:96.9pt;width:77.15pt;height:175.3pt;z-index:251757568;visibility:visible;mso-wrap-style:square;mso-width-percent:0;mso-height-percent:0;mso-wrap-distance-left:9pt;mso-wrap-distance-top:0;mso-wrap-distance-right:9pt;mso-wrap-distance-bottom:0;mso-position-horizontal:absolute;mso-position-horizontal-relative:text;mso-position-vertical:absolute;mso-position-vertical-relative:text;mso-width-percent:0;mso-height-percent:0;mso-width-relative:margin;mso-height-relative:margin;v-text-anchor:top" o:gfxdata="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" filled="f" stroked="f" strokeweight="1pt">
                       <v:textbox inset="0,0,0,0">
                         <w:txbxContent>
                           <w:p>
@@ -1646,7 +2453,7 @@
                 </mc:Choice>
                 <mc:Fallback>
                   <w:pict>
-                    <v:rect w14:anchorId="408EB23E" id="_x0000_s1027" style="position:absolute;left:0;text-align:left;margin-left:369.15pt;margin-top:135.45pt;width:48.15pt;height:17pt;z-index:251764736;visibility:visible;mso-wrap-style:square;mso-width-percent:0;mso-height-percent:0;mso-wrap-distance-left:9pt;mso-wrap-distance-top:0;mso-wrap-distance-right:9pt;mso-wrap-distance-bottom:0;mso-position-horizontal:absolute;mso-position-horizontal-relative:text;mso-position-vertical:absolute;mso-position-vertical-relative:text;mso-width-percent:0;mso-height-percent:0;mso-width-relative:margin;mso-height-relative:margin;v-text-anchor:middle" o:gfxdata="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" fillcolor="black" strokecolor="red" strokeweight="1pt">
+                    <v:rect w14:anchorId="408EB23E" id="_x0000_s1028" style="position:absolute;left:0;text-align:left;margin-left:369.15pt;margin-top:135.45pt;width:48.15pt;height:17pt;z-index:251764736;visibility:visible;mso-wrap-style:square;mso-width-percent:0;mso-height-percent:0;mso-wrap-distance-left:9pt;mso-wrap-distance-top:0;mso-wrap-distance-right:9pt;mso-wrap-distance-bottom:0;mso-position-horizontal:absolute;mso-position-horizontal-relative:text;mso-position-vertical:absolute;mso-position-vertical-relative:text;mso-width-percent:0;mso-height-percent:0;mso-width-relative:margin;mso-height-relative:margin;v-text-anchor:middle" o:gfxdata="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" fillcolor="black" strokecolor="red" strokeweight="1pt">
                       <v:fill opacity="39321f"/>
                       <v:textbox inset="0,0,0,0">
                         <w:txbxContent>
@@ -1824,7 +2631,7 @@
                 </mc:Choice>
                 <mc:Fallback>
                   <w:pict>
-                    <v:rect w14:anchorId="2EAC73DA" id="_x0000_s1028" style="position:absolute;left:0;text-align:left;margin-left:103.3pt;margin-top:378.4pt;width:53.65pt;height:17pt;z-index:251686912;visibility:visible;mso-wrap-style:square;mso-width-percent:0;mso-height-percent:0;mso-wrap-distance-left:9pt;mso-wrap-distance-top:0;mso-wrap-distance-right:9pt;mso-wrap-distance-bottom:0;mso-position-horizontal:absolute;mso-position-horizontal-relative:text;mso-position-vertical:absolute;mso-position-vertical-relative:text;mso-width-percent:0;mso-height-percent:0;mso-width-relative:margin;mso-height-relative:margin;v-text-anchor:middle" o:gfxdata="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" fillcolor="black" strokecolor="red" strokeweight="1pt">
+                    <v:rect w14:anchorId="2EAC73DA" id="_x0000_s1029" style="position:absolute;left:0;text-align:left;margin-left:103.3pt;margin-top:378.4pt;width:53.65pt;height:17pt;z-index:251686912;visibility:visible;mso-wrap-style:square;mso-width-percent:0;mso-height-percent:0;mso-wrap-distance-left:9pt;mso-wrap-distance-top:0;mso-wrap-distance-right:9pt;mso-wrap-distance-bottom:0;mso-position-horizontal:absolute;mso-position-horizontal-relative:text;mso-position-vertical:absolute;mso-position-vertical-relative:text;mso-width-percent:0;mso-height-percent:0;mso-width-relative:margin;mso-height-relative:margin;v-text-anchor:middle" o:gfxdata="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" fillcolor="black" strokecolor="red" strokeweight="1pt">
                       <v:fill opacity="39321f"/>
                       <v:textbox inset="0,0,0,0">
                         <w:txbxContent>
@@ -2034,7 +2841,7 @@
                 </mc:Choice>
                 <mc:Fallback>
                   <w:pict>
-                    <v:rect w14:anchorId="39CCF745" id="_x0000_s1029" style="position:absolute;left:0;text-align:left;margin-left:196.4pt;margin-top:125pt;width:53.1pt;height:41.15pt;z-index:251662336;visibility:visible;mso-wrap-style:square;mso-width-percent:0;mso-height-percent:0;mso-wrap-distance-left:9pt;mso-wrap-distance-top:0;mso-wrap-distance-right:9pt;mso-wrap-distance-bottom:0;mso-position-horizontal:absolute;mso-position-horizontal-relative:text;mso-position-vertical:absolute;mso-position-vertical-relative:text;mso-width-percent:0;mso-height-percent:0;mso-width-relative:margin;mso-height-relative:margin;v-text-anchor:middle" o:gfxdata="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" fillcolor="black" strokecolor="red" strokeweight="1pt">
+                    <v:rect w14:anchorId="39CCF745" id="_x0000_s1030" style="position:absolute;left:0;text-align:left;margin-left:196.4pt;margin-top:125pt;width:53.1pt;height:41.15pt;z-index:251662336;visibility:visible;mso-wrap-style:square;mso-width-percent:0;mso-height-percent:0;mso-wrap-distance-left:9pt;mso-wrap-distance-top:0;mso-wrap-distance-right:9pt;mso-wrap-distance-bottom:0;mso-position-horizontal:absolute;mso-position-horizontal-relative:text;mso-position-vertical:absolute;mso-position-vertical-relative:text;mso-width-percent:0;mso-height-percent:0;mso-width-relative:margin;mso-height-relative:margin;v-text-anchor:middle" o:gfxdata="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" fillcolor="black" strokecolor="red" strokeweight="1pt">
                       <v:fill opacity="39321f"/>
                       <v:textbox inset="0,0,0,0">
                         <w:txbxContent>
@@ -2512,7 +3319,7 @@
                 </mc:Choice>
                 <mc:Fallback>
                   <w:pict>
-                    <v:rect w14:anchorId="2CBDD507" id="_x0000_s1030" style="position:absolute;left:0;text-align:left;margin-left:317.05pt;margin-top:287.35pt;width:54.5pt;height:17pt;z-index:251679744;visibility:visible;mso-wrap-style:square;mso-width-percent:0;mso-height-percent:0;mso-wrap-distance-left:9pt;mso-wrap-distance-top:0;mso-wrap-distance-right:9pt;mso-wrap-distance-bottom:0;mso-position-horizontal:absolute;mso-position-horizontal-relative:text;mso-position-vertical:absolute;mso-position-vertical-relative:text;mso-width-percent:0;mso-height-percent:0;mso-width-relative:margin;mso-height-relative:margin;v-text-anchor:middle" o:gfxdata="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" fillcolor="black" strokecolor="red" strokeweight="1pt">
+                    <v:rect w14:anchorId="2CBDD507" id="_x0000_s1031" style="position:absolute;left:0;text-align:left;margin-left:317.05pt;margin-top:287.35pt;width:54.5pt;height:17pt;z-index:251679744;visibility:visible;mso-wrap-style:square;mso-width-percent:0;mso-height-percent:0;mso-wrap-distance-left:9pt;mso-wrap-distance-top:0;mso-wrap-distance-right:9pt;mso-wrap-distance-bottom:0;mso-position-horizontal:absolute;mso-position-horizontal-relative:text;mso-position-vertical:absolute;mso-position-vertical-relative:text;mso-width-percent:0;mso-height-percent:0;mso-width-relative:margin;mso-height-relative:margin;v-text-anchor:middle" o:gfxdata="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" fillcolor="black" strokecolor="red" strokeweight="1pt">
                       <v:fill opacity="39321f"/>
                       <v:textbox inset="0,0,0,0">
                         <w:txbxContent>
@@ -2690,7 +3497,7 @@
                 </mc:Choice>
                 <mc:Fallback>
                   <w:pict>
-                    <v:rect w14:anchorId="30B8046B" id="_x0000_s1031" style="position:absolute;left:0;text-align:left;margin-left:152.65pt;margin-top:194pt;width:30.95pt;height:17pt;z-index:251666432;visibility:visible;mso-wrap-style:square;mso-width-percent:0;mso-height-percent:0;mso-wrap-distance-left:9pt;mso-wrap-distance-top:0;mso-wrap-distance-right:9pt;mso-wrap-distance-bottom:0;mso-position-horizontal:absolute;mso-position-horizontal-relative:text;mso-position-vertical:absolute;mso-position-vertical-relative:text;mso-width-percent:0;mso-height-percent:0;mso-width-relative:margin;mso-height-relative:margin;v-text-anchor:middle" o:gfxdata="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" fillcolor="black" strokecolor="red" strokeweight="1pt">
+                    <v:rect w14:anchorId="30B8046B" id="_x0000_s1032" style="position:absolute;left:0;text-align:left;margin-left:152.65pt;margin-top:194pt;width:30.95pt;height:17pt;z-index:251666432;visibility:visible;mso-wrap-style:square;mso-width-percent:0;mso-height-percent:0;mso-wrap-distance-left:9pt;mso-wrap-distance-top:0;mso-wrap-distance-right:9pt;mso-wrap-distance-bottom:0;mso-position-horizontal:absolute;mso-position-horizontal-relative:text;mso-position-vertical:absolute;mso-position-vertical-relative:text;mso-width-percent:0;mso-height-percent:0;mso-width-relative:margin;mso-height-relative:margin;v-text-anchor:middle" o:gfxdata="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" fillcolor="black" strokecolor="red" strokeweight="1pt">
                       <v:fill opacity="39321f"/>
                       <v:textbox inset="0,0,0,0">
                         <w:txbxContent>
@@ -2883,7 +3690,7 @@
                 </mc:Choice>
                 <mc:Fallback>
                   <w:pict>
-                    <v:rect w14:anchorId="01FDE6F4" id="_x0000_s1032" style="position:absolute;left:0;text-align:left;margin-left:112.5pt;margin-top:319.05pt;width:33.8pt;height:25.5pt;z-index:251684864;visibility:visible;mso-wrap-style:square;mso-width-percent:0;mso-height-percent:0;mso-wrap-distance-left:9pt;mso-wrap-distance-top:0;mso-wrap-distance-right:9pt;mso-wrap-distance-bottom:0;mso-position-horizontal:absolute;mso-position-horizontal-relative:text;mso-position-vertical:absolute;mso-position-vertical-relative:text;mso-width-percent:0;mso-height-percent:0;mso-width-relative:margin;mso-height-relative:margin;v-text-anchor:middle" o:gfxdata="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" fillcolor="black" strokecolor="red" strokeweight="1pt">
+                    <v:rect w14:anchorId="01FDE6F4" id="_x0000_s1033" style="position:absolute;left:0;text-align:left;margin-left:112.5pt;margin-top:319.05pt;width:33.8pt;height:25.5pt;z-index:251684864;visibility:visible;mso-wrap-style:square;mso-width-percent:0;mso-height-percent:0;mso-wrap-distance-left:9pt;mso-wrap-distance-top:0;mso-wrap-distance-right:9pt;mso-wrap-distance-bottom:0;mso-position-horizontal:absolute;mso-position-horizontal-relative:text;mso-position-vertical:absolute;mso-position-vertical-relative:text;mso-width-percent:0;mso-height-percent:0;mso-width-relative:margin;mso-height-relative:margin;v-text-anchor:middle" o:gfxdata="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" fillcolor="black" strokecolor="red" strokeweight="1pt">
                       <v:fill opacity="39321f"/>
                       <v:textbox inset="0,0,0,0">
                         <w:txbxContent>
@@ -3112,8 +3919,8 @@
                 </mc:Choice>
                 <mc:Fallback>
                   <w:pict>
-                    <v:group w14:anchorId="06CE9835" id="Group 1" o:spid="_x0000_s1033" style="position:absolute;left:0;text-align:left;margin-left:104pt;margin-top:396.55pt;width:18.25pt;height:15.7pt;z-index:251718656;mso-width-relative:margin;mso-height-relative:margin" coordorigin="-68515,232329" coordsize="232323,199560" o:gfxdata="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">
-                      <v:oval id="Oval 1" o:spid="_x0000_s1034" style="position:absolute;top:288915;width:95250;height:95250;visibility:visible;mso-wrap-style:square;v-text-anchor:middle" o:gfxdata="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" fillcolor="#00b050" strokecolor="white [3212]">
+                    <v:group w14:anchorId="06CE9835" id="Group 1" o:spid="_x0000_s1034" style="position:absolute;left:0;text-align:left;margin-left:104pt;margin-top:396.55pt;width:18.25pt;height:15.7pt;z-index:251718656;mso-width-relative:margin;mso-height-relative:margin" coordorigin="-68515,232329" coordsize="232323,199560" o:gfxdata="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">
+                      <v:oval id="Oval 1" o:spid="_x0000_s1035" style="position:absolute;top:288915;width:95250;height:95250;visibility:visible;mso-wrap-style:square;v-text-anchor:middle" o:gfxdata="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" fillcolor="#00b050" strokecolor="white [3212]">
                         <v:stroke joinstyle="miter"/>
                         <v:textbox>
                           <w:txbxContent>
@@ -3137,7 +3944,7 @@
                         <v:stroke joinstyle="miter"/>
                         <v:path gradientshapeok="t" o:connecttype="rect"/>
                       </v:shapetype>
-                      <v:shape id="Text Box 2" o:spid="_x0000_s1035" type="#_x0000_t202" style="position:absolute;left:-68515;top:232329;width:232323;height:199560;visibility:visible;mso-wrap-style:square;v-text-anchor:top" o:gfxdata="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" filled="f" stroked="f">
+                      <v:shape id="Text Box 2" o:spid="_x0000_s1036" type="#_x0000_t202" style="position:absolute;left:-68515;top:232329;width:232323;height:199560;visibility:visible;mso-wrap-style:square;v-text-anchor:top" o:gfxdata="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" filled="f" stroked="f">
                         <v:textbox>
                           <w:txbxContent>
                             <w:p>
@@ -3300,7 +4107,7 @@
                 </mc:Choice>
                 <mc:Fallback>
                   <w:pict>
-                    <v:rect w14:anchorId="52C438C6" id="_x0000_s1036" style="position:absolute;left:0;text-align:left;margin-left:198.2pt;margin-top:392.7pt;width:38.35pt;height:17pt;z-index:251675648;visibility:visible;mso-wrap-style:square;mso-width-percent:0;mso-height-percent:0;mso-wrap-distance-left:9pt;mso-wrap-distance-top:0;mso-wrap-distance-right:9pt;mso-wrap-distance-bottom:0;mso-position-horizontal:absolute;mso-position-horizontal-relative:text;mso-position-vertical:absolute;mso-position-vertical-relative:text;mso-width-percent:0;mso-height-percent:0;mso-width-relative:margin;mso-height-relative:margin;v-text-anchor:middle" o:gfxdata="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" fillcolor="black" strokecolor="red" strokeweight="1pt">
+                    <v:rect w14:anchorId="52C438C6" id="_x0000_s1037" style="position:absolute;left:0;text-align:left;margin-left:198.2pt;margin-top:392.7pt;width:38.35pt;height:17pt;z-index:251675648;visibility:visible;mso-wrap-style:square;mso-width-percent:0;mso-height-percent:0;mso-wrap-distance-left:9pt;mso-wrap-distance-top:0;mso-wrap-distance-right:9pt;mso-wrap-distance-bottom:0;mso-position-horizontal:absolute;mso-position-horizontal-relative:text;mso-position-vertical:absolute;mso-position-vertical-relative:text;mso-width-percent:0;mso-height-percent:0;mso-width-relative:margin;mso-height-relative:margin;v-text-anchor:middle" o:gfxdata="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" fillcolor="black" strokecolor="red" strokeweight="1pt">
                       <v:fill opacity="39321f"/>
                       <v:textbox inset="0,0,0,0">
                         <w:txbxContent>
@@ -3495,7 +4302,7 @@
                 </mc:Choice>
                 <mc:Fallback>
                   <w:pict>
-                    <v:rect w14:anchorId="32A3D3B5" id="_x0000_s1037" style="position:absolute;left:0;text-align:left;margin-left:267.55pt;margin-top:392.75pt;width:60.25pt;height:17pt;z-index:251760640;visibility:visible;mso-wrap-style:square;mso-width-percent:0;mso-height-percent:0;mso-wrap-distance-left:9pt;mso-wrap-distance-top:0;mso-wrap-distance-right:9pt;mso-wrap-distance-bottom:0;mso-position-horizontal:absolute;mso-position-horizontal-relative:text;mso-position-vertical:absolute;mso-position-vertical-relative:text;mso-width-percent:0;mso-height-percent:0;mso-width-relative:margin;mso-height-relative:margin;v-text-anchor:middle" o:gfxdata="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" fillcolor="black" strokecolor="red" strokeweight="1pt">
+                    <v:rect w14:anchorId="32A3D3B5" id="_x0000_s1038" style="position:absolute;left:0;text-align:left;margin-left:267.55pt;margin-top:392.75pt;width:60.25pt;height:17pt;z-index:251760640;visibility:visible;mso-wrap-style:square;mso-width-percent:0;mso-height-percent:0;mso-wrap-distance-left:9pt;mso-wrap-distance-top:0;mso-wrap-distance-right:9pt;mso-wrap-distance-bottom:0;mso-position-horizontal:absolute;mso-position-horizontal-relative:text;mso-position-vertical:absolute;mso-position-vertical-relative:text;mso-width-percent:0;mso-height-percent:0;mso-width-relative:margin;mso-height-relative:margin;v-text-anchor:middle" o:gfxdata="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" fillcolor="black" strokecolor="red" strokeweight="1pt">
                       <v:fill opacity="39321f"/>
                       <v:textbox inset="0,0,0,0">
                         <w:txbxContent>
@@ -3916,7 +4723,7 @@
                 </mc:Choice>
                 <mc:Fallback>
                   <w:pict>
-                    <v:rect w14:anchorId="5011B118" id="_x0000_s1038" style="position:absolute;left:0;text-align:left;margin-left:373.7pt;margin-top:340.7pt;width:68.25pt;height:24.85pt;z-index:251682816;visibility:visible;mso-wrap-style:square;mso-width-percent:0;mso-height-percent:0;mso-wrap-distance-left:9pt;mso-wrap-distance-top:0;mso-wrap-distance-right:9pt;mso-wrap-distance-bottom:0;mso-position-horizontal:absolute;mso-position-horizontal-relative:text;mso-position-vertical:absolute;mso-position-vertical-relative:text;mso-width-percent:0;mso-height-percent:0;mso-width-relative:margin;mso-height-relative:margin;v-text-anchor:middle" o:gfxdata="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" fillcolor="black" strokecolor="red" strokeweight="1pt">
+                    <v:rect w14:anchorId="5011B118" id="_x0000_s1039" style="position:absolute;left:0;text-align:left;margin-left:373.7pt;margin-top:340.7pt;width:68.25pt;height:24.85pt;z-index:251682816;visibility:visible;mso-wrap-style:square;mso-width-percent:0;mso-height-percent:0;mso-wrap-distance-left:9pt;mso-wrap-distance-top:0;mso-wrap-distance-right:9pt;mso-wrap-distance-bottom:0;mso-position-horizontal:absolute;mso-position-horizontal-relative:text;mso-position-vertical:absolute;mso-position-vertical-relative:text;mso-width-percent:0;mso-height-percent:0;mso-width-relative:margin;mso-height-relative:margin;v-text-anchor:middle" o:gfxdata="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" fillcolor="black" strokecolor="red" strokeweight="1pt">
                       <v:fill opacity="39321f"/>
                       <v:textbox inset="0,0,0,0">
                         <w:txbxContent>
@@ -4221,7 +5028,7 @@
                 </mc:Choice>
                 <mc:Fallback>
                   <w:pict>
-                    <v:rect w14:anchorId="7B697D34" id="_x0000_s1039" style="position:absolute;left:0;text-align:left;margin-left:358.45pt;margin-top:392.75pt;width:58.4pt;height:17pt;z-index:251691008;visibility:visible;mso-wrap-style:square;mso-width-percent:0;mso-height-percent:0;mso-wrap-distance-left:9pt;mso-wrap-distance-top:0;mso-wrap-distance-right:9pt;mso-wrap-distance-bottom:0;mso-position-horizontal:absolute;mso-position-horizontal-relative:text;mso-position-vertical:absolute;mso-position-vertical-relative:text;mso-width-percent:0;mso-height-percent:0;mso-width-relative:margin;mso-height-relative:margin;v-text-anchor:middle" o:gfxdata="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" fillcolor="black" strokecolor="red" strokeweight="1pt">
+                    <v:rect w14:anchorId="7B697D34" id="_x0000_s1040" style="position:absolute;left:0;text-align:left;margin-left:358.45pt;margin-top:392.75pt;width:58.4pt;height:17pt;z-index:251691008;visibility:visible;mso-wrap-style:square;mso-width-percent:0;mso-height-percent:0;mso-wrap-distance-left:9pt;mso-wrap-distance-top:0;mso-wrap-distance-right:9pt;mso-wrap-distance-bottom:0;mso-position-horizontal:absolute;mso-position-horizontal-relative:text;mso-position-vertical:absolute;mso-position-vertical-relative:text;mso-width-percent:0;mso-height-percent:0;mso-width-relative:margin;mso-height-relative:margin;v-text-anchor:middle" o:gfxdata="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" fillcolor="black" strokecolor="red" strokeweight="1pt">
                       <v:fill opacity="39321f"/>
                       <v:textbox inset="0,0,0,0">
                         <w:txbxContent>
@@ -4416,11 +5223,11 @@
                 </mc:Choice>
                 <mc:Fallback>
                   <w:pict>
-                    <v:group w14:anchorId="0E037F5D" id="Group 2" o:spid="_x0000_s1040" style="position:absolute;left:0;text-align:left;margin-left:264.2pt;margin-top:451.55pt;width:178.45pt;height:17.6pt;z-index:251707392;mso-width-relative:margin" coordorigin=",95" coordsize="22669,2238" o:gfxdata="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">
-                      <v:oval id="Oval 1" o:spid="_x0000_s1041" style="position:absolute;top:762;width:952;height:952;visibility:visible;mso-wrap-style:square;v-text-anchor:middle" o:gfxdata="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" fillcolor="#00b050" strokecolor="white [3212]">
+                    <v:group w14:anchorId="0E037F5D" id="Group 2" o:spid="_x0000_s1041" style="position:absolute;left:0;text-align:left;margin-left:264.2pt;margin-top:451.55pt;width:178.45pt;height:17.6pt;z-index:251707392;mso-width-relative:margin" coordorigin=",95" coordsize="22669,2238" o:gfxdata="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">
+                      <v:oval id="Oval 1" o:spid="_x0000_s1042" style="position:absolute;top:762;width:952;height:952;visibility:visible;mso-wrap-style:square;v-text-anchor:middle" o:gfxdata="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" fillcolor="#00b050" strokecolor="white [3212]">
                         <v:stroke joinstyle="miter"/>
                       </v:oval>
-                      <v:shape id="Text Box 2" o:spid="_x0000_s1042" type="#_x0000_t202" style="position:absolute;left:523;top:95;width:22146;height:2238;visibility:visible;mso-wrap-style:square;v-text-anchor:top" o:gfxdata="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" filled="f" stroked="f">
+                      <v:shape id="Text Box 2" o:spid="_x0000_s1043" type="#_x0000_t202" style="position:absolute;left:523;top:95;width:22146;height:2238;visibility:visible;mso-wrap-style:square;v-text-anchor:top" o:gfxdata="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" filled="f" stroked="f">
                         <v:textbox>
                           <w:txbxContent>
                             <w:p>
@@ -4583,7 +5390,7 @@
                 </mc:Choice>
                 <mc:Fallback>
                   <w:pict>
-                    <v:rect w14:anchorId="0B986780" id="_x0000_s1043" style="position:absolute;left:0;text-align:left;margin-left:106.75pt;margin-top:135.5pt;width:48.15pt;height:17pt;z-index:251660288;visibility:visible;mso-wrap-style:square;mso-width-percent:0;mso-height-percent:0;mso-wrap-distance-left:9pt;mso-wrap-distance-top:0;mso-wrap-distance-right:9pt;mso-wrap-distance-bottom:0;mso-position-horizontal:absolute;mso-position-horizontal-relative:text;mso-position-vertical:absolute;mso-position-vertical-relative:text;mso-width-percent:0;mso-height-percent:0;mso-width-relative:margin;mso-height-relative:margin;v-text-anchor:middle" o:gfxdata="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" fillcolor="black" strokecolor="red" strokeweight="1pt">
+                    <v:rect w14:anchorId="0B986780" id="_x0000_s1044" style="position:absolute;left:0;text-align:left;margin-left:106.75pt;margin-top:135.5pt;width:48.15pt;height:17pt;z-index:251660288;visibility:visible;mso-wrap-style:square;mso-width-percent:0;mso-height-percent:0;mso-wrap-distance-left:9pt;mso-wrap-distance-top:0;mso-wrap-distance-right:9pt;mso-wrap-distance-bottom:0;mso-position-horizontal:absolute;mso-position-horizontal-relative:text;mso-position-vertical:absolute;mso-position-vertical-relative:text;mso-width-percent:0;mso-height-percent:0;mso-width-relative:margin;mso-height-relative:margin;v-text-anchor:middle" o:gfxdata="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" fillcolor="black" strokecolor="red" strokeweight="1pt">
                       <v:fill opacity="39321f"/>
                       <v:textbox inset="0,0,0,0">
                         <w:txbxContent>
@@ -5022,7 +5829,7 @@
                 </mc:Choice>
                 <mc:Fallback>
                   <w:pict>
-                    <v:rect w14:anchorId="5A88F8DE" id="_x0000_s1044" style="position:absolute;left:0;text-align:left;margin-left:281.6pt;margin-top:329.7pt;width:34pt;height:25.5pt;z-index:251677696;visibility:visible;mso-wrap-style:square;mso-width-percent:0;mso-height-percent:0;mso-wrap-distance-left:9pt;mso-wrap-distance-top:0;mso-wrap-distance-right:9pt;mso-wrap-distance-bottom:0;mso-position-horizontal:absolute;mso-position-horizontal-relative:text;mso-position-vertical:absolute;mso-position-vertical-relative:text;mso-width-percent:0;mso-height-percent:0;mso-width-relative:margin;mso-height-relative:margin;v-text-anchor:middle" o:gfxdata="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" fillcolor="black" strokecolor="red" strokeweight="1pt">
+                    <v:rect w14:anchorId="5A88F8DE" id="_x0000_s1045" style="position:absolute;left:0;text-align:left;margin-left:281.6pt;margin-top:329.7pt;width:34pt;height:25.5pt;z-index:251677696;visibility:visible;mso-wrap-style:square;mso-width-percent:0;mso-height-percent:0;mso-wrap-distance-left:9pt;mso-wrap-distance-top:0;mso-wrap-distance-right:9pt;mso-wrap-distance-bottom:0;mso-position-horizontal:absolute;mso-position-horizontal-relative:text;mso-position-vertical:absolute;mso-position-vertical-relative:text;mso-width-percent:0;mso-height-percent:0;mso-width-relative:margin;mso-height-relative:margin;v-text-anchor:middle" o:gfxdata="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" fillcolor="black" strokecolor="red" strokeweight="1pt">
                       <v:fill opacity="39321f"/>
                       <v:textbox inset="0,0,0,0">
                         <w:txbxContent>
@@ -5215,7 +6022,7 @@
                 </mc:Choice>
                 <mc:Fallback>
                   <w:pict>
-                    <v:rect w14:anchorId="71AA84E9" id="_x0000_s1045" style="position:absolute;left:0;text-align:left;margin-left:202.15pt;margin-top:329.65pt;width:34pt;height:25.5pt;z-index:251669504;visibility:visible;mso-wrap-style:square;mso-width-percent:0;mso-height-percent:0;mso-wrap-distance-left:9pt;mso-wrap-distance-top:0;mso-wrap-distance-right:9pt;mso-wrap-distance-bottom:0;mso-position-horizontal:absolute;mso-position-horizontal-relative:text;mso-position-vertical:absolute;mso-position-vertical-relative:text;mso-width-percent:0;mso-height-percent:0;mso-width-relative:margin;mso-height-relative:margin;v-text-anchor:middle" o:gfxdata="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" fillcolor="black" strokecolor="red" strokeweight="1pt">
+                    <v:rect w14:anchorId="71AA84E9" id="_x0000_s1046" style="position:absolute;left:0;text-align:left;margin-left:202.15pt;margin-top:329.65pt;width:34pt;height:25.5pt;z-index:251669504;visibility:visible;mso-wrap-style:square;mso-width-percent:0;mso-height-percent:0;mso-wrap-distance-left:9pt;mso-wrap-distance-top:0;mso-wrap-distance-right:9pt;mso-wrap-distance-bottom:0;mso-position-horizontal:absolute;mso-position-horizontal-relative:text;mso-position-vertical:absolute;mso-position-vertical-relative:text;mso-width-percent:0;mso-height-percent:0;mso-width-relative:margin;mso-height-relative:margin;v-text-anchor:middle" o:gfxdata="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" fillcolor="black" strokecolor="red" strokeweight="1pt">
                       <v:fill opacity="39321f"/>
                       <v:textbox inset="0,0,0,0">
                         <w:txbxContent>
@@ -5540,7 +6347,7 @@
                 </mc:Choice>
                 <mc:Fallback>
                   <w:pict>
-                    <v:rect w14:anchorId="0A5CB297" id="_x0000_s1046" style="position:absolute;left:0;text-align:left;margin-left:230.1pt;margin-top:414.25pt;width:58.5pt;height:25.5pt;z-index:251688960;visibility:visible;mso-wrap-style:square;mso-width-percent:0;mso-height-percent:0;mso-wrap-distance-left:9pt;mso-wrap-distance-top:0;mso-wrap-distance-right:9pt;mso-wrap-distance-bottom:0;mso-position-horizontal:absolute;mso-position-horizontal-relative:text;mso-position-vertical:absolute;mso-position-vertical-relative:text;mso-width-percent:0;mso-height-percent:0;mso-width-relative:margin;mso-height-relative:margin;v-text-anchor:middle" o:gfxdata="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" fillcolor="black" strokecolor="red" strokeweight="1pt">
+                    <v:rect w14:anchorId="0A5CB297" id="_x0000_s1047" style="position:absolute;left:0;text-align:left;margin-left:230.1pt;margin-top:414.25pt;width:58.5pt;height:25.5pt;z-index:251688960;visibility:visible;mso-wrap-style:square;mso-width-percent:0;mso-height-percent:0;mso-wrap-distance-left:9pt;mso-wrap-distance-top:0;mso-wrap-distance-right:9pt;mso-wrap-distance-bottom:0;mso-position-horizontal:absolute;mso-position-horizontal-relative:text;mso-position-vertical:absolute;mso-position-vertical-relative:text;mso-width-percent:0;mso-height-percent:0;mso-width-relative:margin;mso-height-relative:margin;v-text-anchor:middle" o:gfxdata="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" fillcolor="black" strokecolor="red" strokeweight="1pt">
                       <v:fill opacity="39321f"/>
                       <v:textbox inset="0,0,0,0">
                         <w:txbxContent>
@@ -6240,7 +7047,7 @@
           </mc:Choice>
           <mc:Fallback>
             <w:pict>
-              <v:rect w14:anchorId="37277F15" id="_x0000_s1047" style="position:absolute;margin-left:-16.75pt;margin-top:-106.2pt;width:121.5pt;height:69.1pt;z-index:251754496;visibility:visible;mso-wrap-style:square;mso-width-percent:0;mso-height-percent:0;mso-wrap-distance-left:9pt;mso-wrap-distance-top:0;mso-wrap-distance-right:9pt;mso-wrap-distance-bottom:0;mso-position-horizontal:absolute;mso-position-horizontal-relative:text;mso-position-vertical:absolute;mso-position-vertical-relative:text;mso-width-percent:0;mso-height-percent:0;mso-width-relative:margin;mso-height-relative:margin;v-text-anchor:middle" o:gfxdata="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" fillcolor="black" strokecolor="red" strokeweight="1pt">
+              <v:rect w14:anchorId="37277F15" id="_x0000_s1048" style="position:absolute;margin-left:-16.75pt;margin-top:-106.2pt;width:121.5pt;height:69.1pt;z-index:251754496;visibility:visible;mso-wrap-style:square;mso-width-percent:0;mso-height-percent:0;mso-wrap-distance-left:9pt;mso-wrap-distance-top:0;mso-wrap-distance-right:9pt;mso-wrap-distance-bottom:0;mso-position-horizontal:absolute;mso-position-horizontal-relative:text;mso-position-vertical:absolute;mso-position-vertical-relative:text;mso-width-percent:0;mso-height-percent:0;mso-width-relative:margin;mso-height-relative:margin;v-text-anchor:middle" o:gfxdata="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" fillcolor="black" strokecolor="red" strokeweight="1pt">
                 <v:fill opacity="39321f"/>
                 <v:textbox inset="0,0,0,0">
                   <w:txbxContent>
@@ -7270,58 +8077,109 @@
         <w:tblLook w:val="04A0" w:firstRow="1" w:lastRow="0" w:firstColumn="1" w:lastColumn="0" w:noHBand="0" w:noVBand="1"/>
       </w:tblPr>
       <w:tblGrid>
-        <w:gridCol w:w="8642"/>
-        <w:gridCol w:w="1814"/>
+        <w:gridCol w:w="10244"/>
+        <w:gridCol w:w="222"/>
       </w:tblGrid>
       <w:tr>
         <w:tc>
           <w:tcPr>
-            <w:tcW w:w="8642" w:type="dxa"/>
+            <w:tcW w:w="9499" w:type="dxa"/>
           </w:tcPr>
+          <w:tbl>
+            <w:tblPr>
+              <w:tblStyle w:val="TableGrid"/>
+              <w:tblW w:w="10664" w:type="dxa"/>
+              <w:tblBorders>
+                <w:top w:val="none" w:sz="0" w:space="0" w:color="auto"/>
+                <w:left w:val="none" w:sz="0" w:space="0" w:color="auto"/>
+                <w:bottom w:val="none" w:sz="0" w:space="0" w:color="auto"/>
+                <w:right w:val="none" w:sz="0" w:space="0" w:color="auto"/>
+                <w:insideH w:val="none" w:sz="0" w:space="0" w:color="auto"/>
+                <w:insideV w:val="none" w:sz="0" w:space="0" w:color="auto"/>
+              </w:tblBorders>
+              <w:tblLook w:val="04A0" w:firstRow="1" w:lastRow="0" w:firstColumn="1" w:lastColumn="0" w:noHBand="0" w:noVBand="1"/>
+            </w:tblPr>
+            <w:tblGrid>
+              <w:gridCol w:w="292"/>
+              <w:gridCol w:w="10372"/>
+            </w:tblGrid>
+            <w:tr>
+              <w:tc>
+                <w:tcPr>
+                  <w:tcW w:w="276" w:type="dxa"/>
+                  <w:tcMar>
+                    <w:left w:w="0" w:type="dxa"/>
+                    <w:right w:w="0" w:type="dxa"/>
+                  </w:tcMar>
+                </w:tcPr>
+                <w:p>
+                  <w:r>
+                    <w:rPr>
+                      <w:rFonts w:asciiTheme="majorHAnsi" w:hAnsiTheme="majorHAnsi"/>
+                      <w:b/>
+                      <w:bCs/>
+                      <w:color w:val="FFFFFF" w:themeColor="background1"/>
+                      <w:sz w:val="14"/>
+                      <w:szCs w:val="14"/>
+                    </w:rPr>
+                    <w:t>DLC</w:t>
+                  </w:r>
+                  <w:r>
+                    <w:rPr>
+                      <w:rFonts w:asciiTheme="majorHAnsi" w:hAnsiTheme="majorHAnsi"/>
+                      <w:b/>
+                      <w:bCs/>
+                      <w:color w:val="FFFFFF" w:themeColor="background1"/>
+                      <w:sz w:val="14"/>
+                      <w:szCs w:val="14"/>
+                    </w:rPr>
+                    <w:t>:</w:t>
+                  </w:r>
+                  <w:r>
+                    <w:rPr>
+                      <w:color w:val="FFFFFF" w:themeColor="background1"/>
+                      <w:sz w:val="14"/>
+                      <w:szCs w:val="14"/>
+                    </w:rPr>
+                    <w:t xml:space="preserve"> </w:t>
+                  </w:r>
+                </w:p>
+                <w:p/>
+              </w:tc>
+              <w:tc>
+                <w:tcPr>
+                  <w:tcW w:w="10388" w:type="dxa"/>
+                </w:tcPr>
+                <w:p>
+                  <w:hyperlink r:id="rId15" w:history="1">
+                    <w:r>
+                      <w:rPr>
+                        <w:rStyle w:val="Hyperlink"/>
+                        <w:color w:val="FFFFFF" w:themeColor="background1"/>
+                        <w:sz w:val="14"/>
+                        <w:szCs w:val="14"/>
+                      </w:rPr>
+                      <w:t>https://store.steampowered.com/app/3663320/Train_Sim_World_6_London_Overground_Suffragette_line_Gospel_Oak__Barking_Riverside_Route_AddOn/</w:t>
+                    </w:r>
+                  </w:hyperlink>
+                </w:p>
+              </w:tc>
+            </w:tr>
+          </w:tbl>
           <w:p>
             <w:pPr>
               <w:rPr>
-                <w:rFonts w:ascii="Magneto" w:hAnsi="Magneto"/>
-                <w:color w:val="FFFFFF" w:themeColor="background1"/>
-                <w:sz w:val="16"/>
-                <w:szCs w:val="16"/>
-              </w:rPr>
-            </w:pPr>
-            <w:r>
-              <w:rPr>
                 <w:rFonts w:asciiTheme="majorHAnsi" w:hAnsiTheme="majorHAnsi"/>
-                <w:b/>
-                <w:bCs/>
                 <w:color w:val="FFFFFF" w:themeColor="background1"/>
                 <w:sz w:val="14"/>
                 <w:szCs w:val="14"/>
               </w:rPr>
-              <w:t>Note:</w:t>
-            </w:r>
-            <w:r>
-              <w:rPr>
-                <w:color w:val="FFFFFF" w:themeColor="background1"/>
-                <w:sz w:val="14"/>
-                <w:szCs w:val="14"/>
-              </w:rPr>
-              <w:t xml:space="preserve"> For </w:t>
-            </w:r>
-            <w:hyperlink r:id="rId15" w:history="1">
-              <w:r>
-                <w:rPr>
-                  <w:rStyle w:val="Hyperlink"/>
-                  <w:color w:val="FFFFFF" w:themeColor="background1"/>
-                  <w:sz w:val="14"/>
-                  <w:szCs w:val="14"/>
-                </w:rPr>
-                <w:t>https://store.steampowered.com/app/3879950/Train_Sim_World_6_Southern_BR_Class_171__BR_Class_3773_AddOn/</w:t>
-              </w:r>
-            </w:hyperlink>
+            </w:pPr>
           </w:p>
         </w:tc>
         <w:tc>
           <w:tcPr>
-            <w:tcW w:w="1814" w:type="dxa"/>
+            <w:tcW w:w="967" w:type="dxa"/>
           </w:tcPr>
           <w:p>
             <w:pPr>
@@ -7333,26 +8191,6 @@
                 <w:szCs w:val="16"/>
               </w:rPr>
             </w:pPr>
-            <w:r>
-              <w:rPr>
-                <w:rFonts w:ascii="Magneto" w:hAnsi="Magneto"/>
-                <w:color w:val="FFFFFF" w:themeColor="background1"/>
-                <w:sz w:val="16"/>
-                <w:szCs w:val="16"/>
-              </w:rPr>
-              <w:t>©</w:t>
-            </w:r>
-            <w:proofErr w:type="spellStart"/>
-            <w:r>
-              <w:rPr>
-                <w:rFonts w:ascii="Magneto" w:hAnsi="Magneto"/>
-                <w:color w:val="FFFFFF" w:themeColor="background1"/>
-                <w:sz w:val="16"/>
-                <w:szCs w:val="16"/>
-              </w:rPr>
-              <w:t>TheJAG</w:t>
-            </w:r>
-            <w:proofErr w:type="spellEnd"/>
           </w:p>
         </w:tc>
       </w:tr>
@@ -7369,8 +8207,9 @@
       </w:pPr>
     </w:p>
     <w:sectPr>
+      <w:footerReference w:type="default" r:id="rId16"/>
       <w:pgSz w:w="11906" w:h="16838" w:code="9"/>
-      <w:pgMar w:top="720" w:right="720" w:bottom="720" w:left="720" w:header="709" w:footer="709" w:gutter="0"/>
+      <w:pgMar w:top="720" w:right="720" w:bottom="720" w:left="720" w:header="709" w:footer="397" w:gutter="0"/>
       <w:cols w:space="708"/>
       <w:docGrid w:linePitch="360"/>
     </w:sectPr>
@@ -7401,6 +8240,45 @@
     </w:p>
   </w:endnote>
 </w:endnotes>
+</file>
+
+<file path=word/footer1.xml><?xml version="1.0" encoding="utf-8"?>
+<w:ftr xmlns:wpc="http://schemas.microsoft.com/office/word/2010/wordprocessingCanvas" xmlns:cx="http://schemas.microsoft.com/office/drawing/2014/chartex" xmlns:cx1="http://schemas.microsoft.com/office/drawing/2015/9/8/chartex" xmlns:cx2="http://schemas.microsoft.com/office/drawing/2015/10/21/chartex" xmlns:cx3="http://schemas.microsoft.com/office/drawing/2016/5/9/chartex" xmlns:cx4="http://schemas.microsoft.com/office/drawing/2016/5/10/chartex" xmlns:cx5="http://schemas.microsoft.com/office/drawing/2016/5/11/chartex" xmlns:cx6="http://schemas.microsoft.com/office/drawing/2016/5/12/chartex" xmlns:cx7="http://schemas.microsoft.com/office/drawing/2016/5/13/chartex" xmlns:cx8="http://schemas.microsoft.com/office/drawing/2016/5/14/chartex" xmlns:mc="http://schemas.openxmlformats.org/markup-compatibility/2006" xmlns:aink="http://schemas.microsoft.com/office/drawing/2016/ink" xmlns:am3d="http://schemas.microsoft.com/office/drawing/2017/model3d" xmlns:o="urn:schemas-microsoft-com:office:office" xmlns:oel="http://schemas.microsoft.com/office/2019/extlst" xmlns:r="http://schemas.openxmlformats.org/officeDocument/2006/relationships" xmlns:m="http://schemas.openxmlformats.org/officeDocument/2006/math" xmlns:v="urn:schemas-microsoft-com:vml" xmlns:wp14="http://schemas.microsoft.com/office/word/2010/wordprocessingDrawing" xmlns:wp="http://schemas.openxmlformats.org/drawingml/2006/wordprocessingDrawing" xmlns:w10="urn:schemas-microsoft-com:office:word" xmlns:w="http://schemas.openxmlformats.org/wordprocessingml/2006/main" xmlns:w14="http://schemas.microsoft.com/office/word/2010/wordml" xmlns:w15="http://schemas.microsoft.com/office/word/2012/wordml" xmlns:w16cex="http://schemas.microsoft.com/office/word/2018/wordml/cex" xmlns:w16cid="http://schemas.microsoft.com/office/word/2016/wordml/cid" xmlns:w16="http://schemas.microsoft.com/office/word/2018/wordml" xmlns:w16du="http://schemas.microsoft.com/office/word/2023/wordml/word16du" xmlns:w16sdtdh="http://schemas.microsoft.com/office/word/2020/wordml/sdtdatahash" xmlns:w16sdtfl="http://schemas.microsoft.com/office/word/2024/wordml/sdtformatlock" xmlns:w16se="http://schemas.microsoft.com/office/word/2015/wordml/symex" xmlns:wpg="http://schemas.microsoft.com/office/word/2010/wordprocessingGroup" xmlns:wpi="http://schemas.microsoft.com/office/word/2010/wordprocessingInk" xmlns:wne="http://schemas.microsoft.com/office/word/2006/wordml" xmlns:wps="http://schemas.microsoft.com/office/word/2010/wordprocessingShape" mc:Ignorable="w14 w15 w16se w16cid w16 w16cex w16sdtdh w16sdtfl w16du wp14">
+  <w:p>
+    <w:pPr>
+      <w:pStyle w:val="Footer"/>
+    </w:pPr>
+    <w:r>
+      <w:rPr>
+        <w:rFonts w:ascii="Magneto" w:hAnsi="Magneto"/>
+        <w:color w:val="FFFFFF" w:themeColor="background1"/>
+        <w:sz w:val="16"/>
+        <w:szCs w:val="16"/>
+      </w:rPr>
+      <w:ptab w:relativeTo="margin" w:alignment="right" w:leader="none"/>
+    </w:r>
+    <w:r>
+      <w:rPr>
+        <w:rFonts w:ascii="Magneto" w:hAnsi="Magneto"/>
+        <w:color w:val="FFFFFF" w:themeColor="background1"/>
+        <w:sz w:val="16"/>
+        <w:szCs w:val="16"/>
+      </w:rPr>
+      <w:t>©</w:t>
+    </w:r>
+    <w:proofErr w:type="spellStart"/>
+    <w:r>
+      <w:rPr>
+        <w:rFonts w:ascii="Magneto" w:hAnsi="Magneto"/>
+        <w:color w:val="FFFFFF" w:themeColor="background1"/>
+        <w:sz w:val="16"/>
+        <w:szCs w:val="16"/>
+      </w:rPr>
+      <w:t>TheJAG</w:t>
+    </w:r>
+    <w:proofErr w:type="spellEnd"/>
+  </w:p>
+</w:ftr>
 </file>
 
 <file path=word/footnotes.xml><?xml version="1.0" encoding="utf-8"?>

</xml_diff>